<commit_message>
Document script usage and track data inputs
</commit_message>
<xml_diff>
--- a/shell_test_flow.docx
+++ b/shell_test_flow.docx
@@ -778,6 +778,511 @@
             <w:proofErr w:type="spellEnd"/>
             <w:r>
               <w:t>%)</w:t>
+            </w:r>
+          </w:p>
+        </w:tc>
+      </w:tr>
+      <w:tr>
+        <w:tc>
+          <w:tcPr>
+            <w:tcW w:w="5090" w:type="dxa"/>
+            <w:tcBorders>
+              <w:top w:val="single" w:sz="4" w:space="0" w:color="auto"/>
+            </w:tcBorders>
+            <w:shd w:val="clear" w:color="auto" w:fill="F3F3F3"/>
+          </w:tcPr>
+          <w:p>
+            <w:r>
+              <w:t>Diabetes</w:t>
+            </w:r>
+          </w:p>
+        </w:tc>
+        <w:tc>
+          <w:tcPr>
+            <w:tcW w:w="1519" w:type="dxa"/>
+            <w:tcBorders>
+              <w:top w:val="single" w:sz="4" w:space="0" w:color="auto"/>
+            </w:tcBorders>
+            <w:shd w:val="clear" w:color="auto" w:fill="F3F3F3"/>
+          </w:tcPr>
+          <w:p>
+            <w:r/>
+          </w:p>
+        </w:tc>
+        <w:tc>
+          <w:tcPr>
+            <w:tcW w:w="3741" w:type="dxa"/>
+            <w:tcBorders>
+              <w:top w:val="single" w:sz="4" w:space="0" w:color="auto"/>
+            </w:tcBorders>
+            <w:shd w:val="clear" w:color="auto" w:fill="F3F3F3"/>
+          </w:tcPr>
+          <w:p>
+            <w:r/>
+          </w:p>
+        </w:tc>
+      </w:tr>
+      <w:tr>
+        <w:tc>
+          <w:tcPr>
+            <w:tcW w:w="5090" w:type="dxa"/>
+            <w:shd w:val="clear" w:color="auto" w:fill="F3F3F3"/>
+          </w:tcPr>
+          <w:p>
+            <w:r>
+              <w:t>n</w:t>
+            </w:r>
+          </w:p>
+        </w:tc>
+        <w:tc>
+          <w:tcPr>
+            <w:tcW w:w="1519" w:type="dxa"/>
+            <w:shd w:val="clear" w:color="auto" w:fill="F3F3F3"/>
+          </w:tcPr>
+          <w:p>
+            <w:r>
+              <w:t>nnn</w:t>
+            </w:r>
+          </w:p>
+        </w:tc>
+        <w:tc>
+          <w:tcPr>
+            <w:tcW w:w="3741" w:type="dxa"/>
+            <w:shd w:val="clear" w:color="auto" w:fill="F3F3F3"/>
+          </w:tcPr>
+          <w:p>
+            <w:r>
+              <w:t>nnn</w:t>
+            </w:r>
+          </w:p>
+        </w:tc>
+      </w:tr>
+      <w:tr>
+        <w:tc>
+          <w:tcPr>
+            <w:tcW w:w="5090" w:type="dxa"/>
+            <w:shd w:val="clear" w:color="auto" w:fill="F3F3F3"/>
+          </w:tcPr>
+          <w:p>
+            <w:r>
+              <w:t>Yes</w:t>
+            </w:r>
+          </w:p>
+        </w:tc>
+        <w:tc>
+          <w:tcPr>
+            <w:tcW w:w="1519" w:type="dxa"/>
+            <w:shd w:val="clear" w:color="auto" w:fill="F3F3F3"/>
+          </w:tcPr>
+          <w:p>
+            <w:r>
+              <w:t>nn (xx.x%)</w:t>
+            </w:r>
+          </w:p>
+        </w:tc>
+        <w:tc>
+          <w:tcPr>
+            <w:tcW w:w="3741" w:type="dxa"/>
+            <w:shd w:val="clear" w:color="auto" w:fill="F3F3F3"/>
+          </w:tcPr>
+          <w:p>
+            <w:r>
+              <w:t>nn (xx.x%)</w:t>
+            </w:r>
+          </w:p>
+        </w:tc>
+      </w:tr>
+      <w:tr>
+        <w:tc>
+          <w:tcPr>
+            <w:tcW w:w="5090" w:type="dxa"/>
+            <w:shd w:val="clear" w:color="auto" w:fill="F3F3F3"/>
+          </w:tcPr>
+          <w:p>
+            <w:r>
+              <w:t>No</w:t>
+            </w:r>
+          </w:p>
+        </w:tc>
+        <w:tc>
+          <w:tcPr>
+            <w:tcW w:w="1519" w:type="dxa"/>
+            <w:shd w:val="clear" w:color="auto" w:fill="F3F3F3"/>
+          </w:tcPr>
+          <w:p>
+            <w:r>
+              <w:t>nn (xx.x%)</w:t>
+            </w:r>
+          </w:p>
+        </w:tc>
+        <w:tc>
+          <w:tcPr>
+            <w:tcW w:w="3741" w:type="dxa"/>
+            <w:shd w:val="clear" w:color="auto" w:fill="F3F3F3"/>
+          </w:tcPr>
+          <w:p>
+            <w:r>
+              <w:t>nn (xx.x%)</w:t>
+            </w:r>
+          </w:p>
+        </w:tc>
+      </w:tr>
+      <w:tr>
+        <w:tc>
+          <w:tcPr>
+            <w:tcW w:w="5090" w:type="dxa"/>
+            <w:tcBorders>
+              <w:top w:val="single" w:sz="4" w:space="0" w:color="auto"/>
+            </w:tcBorders>
+            <w:shd w:val="clear" w:color="auto" w:fill="F3F3F3"/>
+          </w:tcPr>
+          <w:p>
+            <w:r>
+              <w:t>Kidney disease</w:t>
+            </w:r>
+          </w:p>
+        </w:tc>
+        <w:tc>
+          <w:tcPr>
+            <w:tcW w:w="1519" w:type="dxa"/>
+            <w:tcBorders>
+              <w:top w:val="single" w:sz="4" w:space="0" w:color="auto"/>
+            </w:tcBorders>
+            <w:shd w:val="clear" w:color="auto" w:fill="F3F3F3"/>
+          </w:tcPr>
+          <w:p>
+            <w:r/>
+          </w:p>
+        </w:tc>
+        <w:tc>
+          <w:tcPr>
+            <w:tcW w:w="3741" w:type="dxa"/>
+            <w:tcBorders>
+              <w:top w:val="single" w:sz="4" w:space="0" w:color="auto"/>
+            </w:tcBorders>
+            <w:shd w:val="clear" w:color="auto" w:fill="F3F3F3"/>
+          </w:tcPr>
+          <w:p>
+            <w:r/>
+          </w:p>
+        </w:tc>
+      </w:tr>
+      <w:tr>
+        <w:tc>
+          <w:tcPr>
+            <w:tcW w:w="5090" w:type="dxa"/>
+            <w:shd w:val="clear" w:color="auto" w:fill="F3F3F3"/>
+          </w:tcPr>
+          <w:p>
+            <w:r>
+              <w:t>n</w:t>
+            </w:r>
+          </w:p>
+        </w:tc>
+        <w:tc>
+          <w:tcPr>
+            <w:tcW w:w="1519" w:type="dxa"/>
+            <w:shd w:val="clear" w:color="auto" w:fill="F3F3F3"/>
+          </w:tcPr>
+          <w:p>
+            <w:r>
+              <w:t>nnn</w:t>
+            </w:r>
+          </w:p>
+        </w:tc>
+        <w:tc>
+          <w:tcPr>
+            <w:tcW w:w="3741" w:type="dxa"/>
+            <w:shd w:val="clear" w:color="auto" w:fill="F3F3F3"/>
+          </w:tcPr>
+          <w:p>
+            <w:r>
+              <w:t>nnn</w:t>
+            </w:r>
+          </w:p>
+        </w:tc>
+      </w:tr>
+      <w:tr>
+        <w:tc>
+          <w:tcPr>
+            <w:tcW w:w="5090" w:type="dxa"/>
+            <w:shd w:val="clear" w:color="auto" w:fill="F3F3F3"/>
+          </w:tcPr>
+          <w:p>
+            <w:r>
+              <w:t>Stage 1</w:t>
+            </w:r>
+          </w:p>
+        </w:tc>
+        <w:tc>
+          <w:tcPr>
+            <w:tcW w:w="1519" w:type="dxa"/>
+            <w:shd w:val="clear" w:color="auto" w:fill="F3F3F3"/>
+          </w:tcPr>
+          <w:p>
+            <w:r>
+              <w:t>nn (xx.x%)</w:t>
+            </w:r>
+          </w:p>
+        </w:tc>
+        <w:tc>
+          <w:tcPr>
+            <w:tcW w:w="3741" w:type="dxa"/>
+            <w:shd w:val="clear" w:color="auto" w:fill="F3F3F3"/>
+          </w:tcPr>
+          <w:p>
+            <w:r>
+              <w:t>nn (xx.x%)</w:t>
+            </w:r>
+          </w:p>
+        </w:tc>
+      </w:tr>
+      <w:tr>
+        <w:tc>
+          <w:tcPr>
+            <w:tcW w:w="5090" w:type="dxa"/>
+            <w:shd w:val="clear" w:color="auto" w:fill="F3F3F3"/>
+          </w:tcPr>
+          <w:p>
+            <w:r>
+              <w:t>Stage 2</w:t>
+            </w:r>
+          </w:p>
+        </w:tc>
+        <w:tc>
+          <w:tcPr>
+            <w:tcW w:w="1519" w:type="dxa"/>
+            <w:shd w:val="clear" w:color="auto" w:fill="F3F3F3"/>
+          </w:tcPr>
+          <w:p>
+            <w:r>
+              <w:t>nn (xx.x%)</w:t>
+            </w:r>
+          </w:p>
+        </w:tc>
+        <w:tc>
+          <w:tcPr>
+            <w:tcW w:w="3741" w:type="dxa"/>
+            <w:shd w:val="clear" w:color="auto" w:fill="F3F3F3"/>
+          </w:tcPr>
+          <w:p>
+            <w:r>
+              <w:t>nn (xx.x%)</w:t>
+            </w:r>
+          </w:p>
+        </w:tc>
+      </w:tr>
+      <w:tr>
+        <w:tc>
+          <w:tcPr>
+            <w:tcW w:w="5090" w:type="dxa"/>
+            <w:shd w:val="clear" w:color="auto" w:fill="F3F3F3"/>
+          </w:tcPr>
+          <w:p>
+            <w:r>
+              <w:t>Stage 3</w:t>
+            </w:r>
+          </w:p>
+        </w:tc>
+        <w:tc>
+          <w:tcPr>
+            <w:tcW w:w="1519" w:type="dxa"/>
+            <w:shd w:val="clear" w:color="auto" w:fill="F3F3F3"/>
+          </w:tcPr>
+          <w:p>
+            <w:r>
+              <w:t>nn (xx.x%)</w:t>
+            </w:r>
+          </w:p>
+        </w:tc>
+        <w:tc>
+          <w:tcPr>
+            <w:tcW w:w="3741" w:type="dxa"/>
+            <w:shd w:val="clear" w:color="auto" w:fill="F3F3F3"/>
+          </w:tcPr>
+          <w:p>
+            <w:r>
+              <w:t>nn (xx.x%)</w:t>
+            </w:r>
+          </w:p>
+        </w:tc>
+      </w:tr>
+      <w:tr>
+        <w:tc>
+          <w:tcPr>
+            <w:tcW w:w="5090" w:type="dxa"/>
+            <w:tcBorders>
+              <w:top w:val="single" w:sz="4" w:space="0" w:color="auto"/>
+            </w:tcBorders>
+            <w:shd w:val="clear" w:color="auto" w:fill="F3F3F3"/>
+          </w:tcPr>
+          <w:p>
+            <w:r>
+              <w:t>Blood pressure at baseline</w:t>
+            </w:r>
+          </w:p>
+        </w:tc>
+        <w:tc>
+          <w:tcPr>
+            <w:tcW w:w="1519" w:type="dxa"/>
+            <w:tcBorders>
+              <w:top w:val="single" w:sz="4" w:space="0" w:color="auto"/>
+            </w:tcBorders>
+            <w:shd w:val="clear" w:color="auto" w:fill="F3F3F3"/>
+          </w:tcPr>
+          <w:p>
+            <w:r/>
+          </w:p>
+        </w:tc>
+        <w:tc>
+          <w:tcPr>
+            <w:tcW w:w="3741" w:type="dxa"/>
+            <w:tcBorders>
+              <w:top w:val="single" w:sz="4" w:space="0" w:color="auto"/>
+            </w:tcBorders>
+            <w:shd w:val="clear" w:color="auto" w:fill="F3F3F3"/>
+          </w:tcPr>
+          <w:p>
+            <w:r/>
+          </w:p>
+        </w:tc>
+      </w:tr>
+      <w:tr>
+        <w:tc>
+          <w:tcPr>
+            <w:tcW w:w="5090" w:type="dxa"/>
+            <w:shd w:val="clear" w:color="auto" w:fill="F3F3F3"/>
+          </w:tcPr>
+          <w:p>
+            <w:r>
+              <w:t>n</w:t>
+            </w:r>
+          </w:p>
+        </w:tc>
+        <w:tc>
+          <w:tcPr>
+            <w:tcW w:w="1519" w:type="dxa"/>
+            <w:shd w:val="clear" w:color="auto" w:fill="F3F3F3"/>
+          </w:tcPr>
+          <w:p>
+            <w:r>
+              <w:t>nnn</w:t>
+            </w:r>
+          </w:p>
+        </w:tc>
+        <w:tc>
+          <w:tcPr>
+            <w:tcW w:w="3741" w:type="dxa"/>
+            <w:shd w:val="clear" w:color="auto" w:fill="F3F3F3"/>
+          </w:tcPr>
+          <w:p>
+            <w:r>
+              <w:t>nnn</w:t>
+            </w:r>
+          </w:p>
+        </w:tc>
+      </w:tr>
+      <w:tr>
+        <w:tc>
+          <w:tcPr>
+            <w:tcW w:w="5090" w:type="dxa"/>
+            <w:shd w:val="clear" w:color="auto" w:fill="F3F3F3"/>
+          </w:tcPr>
+          <w:p>
+            <w:r>
+              <w:t>Mean (SD)</w:t>
+            </w:r>
+          </w:p>
+        </w:tc>
+        <w:tc>
+          <w:tcPr>
+            <w:tcW w:w="1519" w:type="dxa"/>
+            <w:shd w:val="clear" w:color="auto" w:fill="F3F3F3"/>
+          </w:tcPr>
+          <w:p>
+            <w:r>
+              <w:t>xx.x (xx.x)</w:t>
+            </w:r>
+          </w:p>
+        </w:tc>
+        <w:tc>
+          <w:tcPr>
+            <w:tcW w:w="3741" w:type="dxa"/>
+            <w:shd w:val="clear" w:color="auto" w:fill="F3F3F3"/>
+          </w:tcPr>
+          <w:p>
+            <w:r>
+              <w:t>xx.x (xx.x)</w:t>
+            </w:r>
+          </w:p>
+        </w:tc>
+      </w:tr>
+      <w:tr>
+        <w:tc>
+          <w:tcPr>
+            <w:tcW w:w="5090" w:type="dxa"/>
+            <w:shd w:val="clear" w:color="auto" w:fill="F3F3F3"/>
+          </w:tcPr>
+          <w:p>
+            <w:r>
+              <w:t>Median</w:t>
+            </w:r>
+          </w:p>
+        </w:tc>
+        <w:tc>
+          <w:tcPr>
+            <w:tcW w:w="1519" w:type="dxa"/>
+            <w:shd w:val="clear" w:color="auto" w:fill="F3F3F3"/>
+          </w:tcPr>
+          <w:p>
+            <w:r>
+              <w:t>xx.x</w:t>
+            </w:r>
+          </w:p>
+        </w:tc>
+        <w:tc>
+          <w:tcPr>
+            <w:tcW w:w="3741" w:type="dxa"/>
+            <w:shd w:val="clear" w:color="auto" w:fill="F3F3F3"/>
+          </w:tcPr>
+          <w:p>
+            <w:r>
+              <w:t>xx.x</w:t>
+            </w:r>
+          </w:p>
+        </w:tc>
+      </w:tr>
+      <w:tr>
+        <w:tc>
+          <w:tcPr>
+            <w:tcW w:w="5090" w:type="dxa"/>
+            <w:shd w:val="clear" w:color="auto" w:fill="F3F3F3"/>
+          </w:tcPr>
+          <w:p>
+            <w:r>
+              <w:t>Minmax</w:t>
+            </w:r>
+          </w:p>
+        </w:tc>
+        <w:tc>
+          <w:tcPr>
+            <w:tcW w:w="1519" w:type="dxa"/>
+            <w:shd w:val="clear" w:color="auto" w:fill="F3F3F3"/>
+          </w:tcPr>
+          <w:p>
+            <w:r>
+              <w:t>xxxx</w:t>
+            </w:r>
+          </w:p>
+        </w:tc>
+        <w:tc>
+          <w:tcPr>
+            <w:tcW w:w="3741" w:type="dxa"/>
+            <w:shd w:val="clear" w:color="auto" w:fill="F3F3F3"/>
+          </w:tcPr>
+          <w:p>
+            <w:r>
+              <w:t>xxxx</w:t>
             </w:r>
           </w:p>
         </w:tc>

</xml_diff>